<commit_message>
RA2: unifica exercicis i pràctica en un dossier per AA, substitueix EverPia per Puig Castellar Tech i afegeix el títol del terminal per identificar les captures
Co-Authored-By: Claude Opus 5.5 <noreply@anthropic.com>
Claude-Session: https://claude.ai/code/session_01BodJZ9PsepvknsFhsdyYkP
</commit_message>
<xml_diff>
--- a/RA2 - Emmagatzematge i copies de seguretat/AA1 - Protegint les dades/A2.1_Exercicis_Protegint_les_dades.docx
+++ b/RA2 - Emmagatzematge i copies de seguretat/AA1 - Protegint les dades/A2.1_Exercicis_Protegint_les_dades.docx
@@ -488,7 +488,7 @@
                 <w:szCs w:val="20"/>
                 <w:rtl w:val="0"/>
               </w:rPr>
-              <w:t xml:space="preserve">Aquesta activitat es cenyeix exclusivament a l'apartat NF2-AA1 (Protegint les dades) del RA2: continuïtat de negoci i recuperació de desastres, redundància, cicle de vida de les dades i destrucció segura de suports. Els exercicis requereixen recerca a Internet i, en un cas, l'anàlisi d'un vídeo. L'exercici 7 és una pràctica guiada a Ubuntu 26.04 (terminal), en què caldrà lliurar captures de pantalla amb el nom d'equip personalitzat. Respon de manera clara i justificada, citant les fonts que consultis.</w:t>
+              <w:t xml:space="preserve">Aquesta activitat es cenyeix exclusivament a l'apartat NF2-AA1 (Protegint les dades) del RA2: continuïtat de negoci i recuperació de desastres, redundància, cicle de vida de les dades i destrucció segura de suports. Els exercicis requereixen recerca a Internet i, en un cas, l'anàlisi d'un vídeo. L'exercici 7 és una pràctica guiada a Ubuntu 26.04 (terminal), en què caldrà lliurar captures de pantalla amb el títol del terminal personalitzat. Respon de manera clara i justificada, citant les fonts que consultis.</w:t>
             </w:r>
           </w:p>
         </w:tc>
@@ -1778,7 +1778,6 @@
             </w:pPr>
             <w:r>
               <w:rPr>
-                <w:bCs/>
                 <w:b/>
                 <w:sz w:val="20"/>
                 <w:szCs w:val="20"/>
@@ -1792,64 +1791,7 @@
                 <w:szCs w:val="20"/>
                 <w:rtl w:val="0"/>
               </w:rPr>
-              <w:t xml:space="preserve">Personalitza el nom de l'equip perquè les captures siguin teves: canvia'l per pc-nomcognom, substituint nomcognom pel teu nom i primer cognom, en minúscules i sense espais ni accents (per exemple, pc-martapuig). Després tanca el terminal i obre'n un de nou: el nom nou ha d'aparèixer a l'indicador (alumne@pc-nomcognom). Totes les captures de la pràctica han de mostrar aquest nom. [CAPTURA]</w:t>
-            </w:r>
-          </w:p>
-          <w:p>
-            <w:pPr>
-              <w:pBdr>
-                <w:top w:val="single" w:color="CADCE8" w:sz="4"/>
-                <w:bottom w:val="single" w:color="CADCE8" w:sz="4"/>
-                <w:left w:val="single" w:color="CADCE8" w:sz="4"/>
-                <w:right w:val="single" w:color="CADCE8" w:sz="4"/>
-              </w:pBdr>
-              <w:shd w:fill="F4F7F9" w:val="clear"/>
-              <w:spacing w:after="160" w:before="80"/>
-              <w:jc w:val="left"/>
-            </w:pPr>
-            <w:r>
-              <w:rPr>
-                <w:rFonts w:ascii="Consolas" w:cs="Consolas" w:eastAsia="Consolas" w:hAnsi="Consolas"/>
-                <w:sz w:val="19"/>
-                <w:szCs w:val="19"/>
-              </w:rPr>
-              <w:t xml:space="preserve">hostname</w:t>
-            </w:r>
-            <w:r>
-              <w:br/>
-              <w:t xml:space="preserve"/>
-            </w:r>
-            <w:r>
-              <w:rPr>
-                <w:rFonts w:ascii="Consolas" w:cs="Consolas" w:eastAsia="Consolas" w:hAnsi="Consolas"/>
-                <w:sz w:val="19"/>
-                <w:szCs w:val="19"/>
-              </w:rPr>
-              <w:t xml:space="preserve">sudo hostnamectl set-hostname pc-nomcognom</w:t>
-            </w:r>
-            <w:r>
-              <w:br/>
-              <w:t xml:space="preserve"/>
-            </w:r>
-            <w:r>
-              <w:rPr>
-                <w:rFonts w:ascii="Consolas" w:cs="Consolas" w:eastAsia="Consolas" w:hAnsi="Consolas"/>
-                <w:sz w:val="19"/>
-                <w:szCs w:val="19"/>
-              </w:rPr>
-              <w:t xml:space="preserve"># Tanca el terminal i obre'n un de nou</w:t>
-            </w:r>
-            <w:r>
-              <w:br/>
-              <w:t xml:space="preserve"/>
-            </w:r>
-            <w:r>
-              <w:rPr>
-                <w:rFonts w:ascii="Consolas" w:cs="Consolas" w:eastAsia="Consolas" w:hAnsi="Consolas"/>
-                <w:sz w:val="19"/>
-                <w:szCs w:val="19"/>
-              </w:rPr>
-              <w:t xml:space="preserve">hostname</w:t>
+              <w:t xml:space="preserve">Personalitza el títol del terminal perquè les captures siguin teves. Fes clic dret dins del terminal → «Estableix el títol». Al camp Títol, escriu les teves inicials i el teu nom i cognom, p. ex. JS - Nom Cognom, i clica fora del pop-up. El títol apareixerà a la barra superior de la finestra (p. ex. «JS - Nom Cognom - alumne@equip: ~»). Totes les captures de la pràctica han de mostrar aquest títol. [CAPTURA]</w:t>
             </w:r>
           </w:p>
           <w:p>
@@ -1870,7 +1812,7 @@
               </w:rPr>
               <w:drawing>
                 <wp:inline distT="0" distB="0" distL="0" distR="0">
-                  <wp:extent cx="4382346" cy="1449493"/>
+                  <wp:extent cx="4382346" cy="2518319"/>
                   <wp:effectExtent t="0" r="0" b="0" l="0"/>
                   <wp:docPr id="1" name="" descr="" title=""/>
                   <wp:cNvGraphicFramePr>
@@ -1886,7 +1828,7 @@
                           </pic:cNvPicPr>
                         </pic:nvPicPr>
                         <pic:blipFill>
-                          <a:blip r:embed="rId2" cstate="none"/>
+                          <a:blip r:embed="rId18" cstate="none"/>
                           <a:srcRect/>
                           <a:stretch>
                             <a:fillRect/>
@@ -1895,7 +1837,7 @@
                         <pic:spPr bwMode="auto">
                           <a:xfrm>
                             <a:off x="0" y="0"/>
-                            <a:ext cx="4382346" cy="1449493"/>
+                            <a:ext cx="4382346" cy="2518319"/>
                           </a:xfrm>
                           <a:prstGeom prst="rect">
                             <a:avLst/>
@@ -1920,62 +1862,6 @@
             </w:pPr>
             <w:r>
               <w:rPr>
-                <w:sz w:val="20"/>
-                <w:szCs w:val="20"/>
-                <w:rtl w:val="0"/>
-              </w:rPr>
-              <w:drawing>
-                <wp:inline distT="0" distB="0" distL="0" distR="0">
-                  <wp:extent cx="4199466" cy="921173"/>
-                  <wp:effectExtent t="0" r="0" b="0" l="0"/>
-                  <wp:docPr id="1" name="" descr="" title=""/>
-                  <wp:cNvGraphicFramePr>
-                    <a:graphicFrameLocks noChangeAspect="1"/>
-                  </wp:cNvGraphicFramePr>
-                  <a:graphic>
-                    <a:graphicData uri="http://schemas.openxmlformats.org/drawingml/2006/picture">
-                      <pic:pic>
-                        <pic:nvPicPr>
-                          <pic:cNvPr id="0" name="" descr=""/>
-                          <pic:cNvPicPr>
-                            <a:picLocks noChangeAspect="1" noChangeArrowheads="1"/>
-                          </pic:cNvPicPr>
-                        </pic:nvPicPr>
-                        <pic:blipFill>
-                          <a:blip r:embed="rId9" cstate="none"/>
-                          <a:srcRect/>
-                          <a:stretch>
-                            <a:fillRect/>
-                          </a:stretch>
-                        </pic:blipFill>
-                        <pic:spPr bwMode="auto">
-                          <a:xfrm>
-                            <a:off x="0" y="0"/>
-                            <a:ext cx="4199466" cy="921173"/>
-                          </a:xfrm>
-                          <a:prstGeom prst="rect">
-                            <a:avLst/>
-                          </a:prstGeom>
-                        </pic:spPr>
-                      </pic:pic>
-                    </a:graphicData>
-                  </a:graphic>
-                </wp:inline>
-              </w:drawing>
-            </w:r>
-          </w:p>
-          <w:p>
-            <w:pPr>
-              <w:widowControl w:val="1"/>
-              <w:spacing w:line="240" w:lineRule="auto" w:after="100"/>
-              <w:rPr>
-                <w:color w:val="1155cc"/>
-                <w:sz w:val="20"/>
-                <w:szCs w:val="20"/>
-              </w:rPr>
-            </w:pPr>
-            <w:r>
-              <w:rPr>
                 <w:color w:val="5B6B77"/>
                 <w:iCs/>
                 <w:i/>
@@ -1983,7 +1869,7 @@
                 <w:szCs w:val="20"/>
                 <w:rtl w:val="0"/>
               </w:rPr>
-              <w:t xml:space="preserve">Captura real (Ubuntu 26.04): canvi del nom de l'equip amb hostnamectl. L'indicador només canvia en obrir un terminal nou.</w:t>
+              <w:t xml:space="preserve">Captura d'exemple: diàleg «Estableix el títol» del terminal d'Ubuntu (en aquesta captura, amb la interfície en castellà: «Establecer título»).</w:t>
             </w:r>
           </w:p>
           <w:p>
@@ -2128,7 +2014,7 @@
                 <wp:inline distT="0" distB="0" distL="0" distR="0">
                   <wp:extent cx="5147733" cy="4443306"/>
                   <wp:effectExtent t="0" r="0" b="0" l="0"/>
-                  <wp:docPr id="1" name="" descr="" title=""/>
+                  <wp:docPr id="2" name="" descr="" title=""/>
                   <wp:cNvGraphicFramePr>
                     <a:graphicFrameLocks noChangeAspect="1"/>
                   </wp:cNvGraphicFramePr>
@@ -2292,7 +2178,7 @@
                 <wp:inline distT="0" distB="0" distL="0" distR="0">
                   <wp:extent cx="5669280" cy="2775447"/>
                   <wp:effectExtent t="0" r="0" b="0" l="0"/>
-                  <wp:docPr id="1" name="" descr="" title=""/>
+                  <wp:docPr id="3" name="" descr="" title=""/>
                   <wp:cNvGraphicFramePr>
                     <a:graphicFrameLocks noChangeAspect="1"/>
                   </wp:cNvGraphicFramePr>
@@ -2468,7 +2354,7 @@
                 <wp:inline distT="0" distB="0" distL="0" distR="0">
                   <wp:extent cx="5425440" cy="2682240"/>
                   <wp:effectExtent t="0" r="0" b="0" l="0"/>
-                  <wp:docPr id="1" name="" descr="" title=""/>
+                  <wp:docPr id="4" name="" descr="" title=""/>
                   <wp:cNvGraphicFramePr>
                     <a:graphicFrameLocks noChangeAspect="1"/>
                   </wp:cNvGraphicFramePr>
@@ -2639,7 +2525,7 @@
                 <wp:inline distT="0" distB="0" distL="0" distR="0">
                   <wp:extent cx="5560906" cy="2858346"/>
                   <wp:effectExtent t="0" r="0" b="0" l="0"/>
-                  <wp:docPr id="1" name="" descr="" title=""/>
+                  <wp:docPr id="5" name="" descr="" title=""/>
                   <wp:cNvGraphicFramePr>
                     <a:graphicFrameLocks noChangeAspect="1"/>
                   </wp:cNvGraphicFramePr>
@@ -2827,7 +2713,7 @@
                 <wp:inline distT="0" distB="0" distL="0" distR="0">
                   <wp:extent cx="5669280" cy="3972442"/>
                   <wp:effectExtent t="0" r="0" b="0" l="0"/>
-                  <wp:docPr id="1" name="" descr="" title=""/>
+                  <wp:docPr id="6" name="" descr="" title=""/>
                   <wp:cNvGraphicFramePr>
                     <a:graphicFrameLocks noChangeAspect="1"/>
                   </wp:cNvGraphicFramePr>

</xml_diff>